<commit_message>
Update routes and controller, add a login/logout option
</commit_message>
<xml_diff>
--- a/HTML-CSS/Preconception/Cahier des charges.docx
+++ b/HTML-CSS/Preconception/Cahier des charges.docx
@@ -1,6 +1,6 @@
 
 <file path=word/document.xml><?xml version="1.0" encoding="utf-8"?>
-<w:document xmlns:wpc="http://schemas.microsoft.com/office/word/2010/wordprocessingCanvas" xmlns:cx="http://schemas.microsoft.com/office/drawing/2014/chartex" xmlns:cx1="http://schemas.microsoft.com/office/drawing/2015/9/8/chartex" xmlns:cx2="http://schemas.microsoft.com/office/drawing/2015/10/21/chartex" xmlns:cx3="http://schemas.microsoft.com/office/drawing/2016/5/9/chartex" xmlns:cx4="http://schemas.microsoft.com/office/drawing/2016/5/10/chartex" xmlns:cx5="http://schemas.microsoft.com/office/drawing/2016/5/11/chartex" xmlns:cx6="http://schemas.microsoft.com/office/drawing/2016/5/12/chartex" xmlns:cx7="http://schemas.microsoft.com/office/drawing/2016/5/13/chartex" xmlns:cx8="http://schemas.microsoft.com/office/drawing/2016/5/14/chartex" xmlns:mc="http://schemas.openxmlformats.org/markup-compatibility/2006" xmlns:aink="http://schemas.microsoft.com/office/drawing/2016/ink" xmlns:am3d="http://schemas.microsoft.com/office/drawing/2017/model3d" xmlns:o="urn:schemas-microsoft-com:office:office" xmlns:oel="http://schemas.microsoft.com/office/2019/extlst" xmlns:r="http://schemas.openxmlformats.org/officeDocument/2006/relationships" xmlns:m="http://schemas.openxmlformats.org/officeDocument/2006/math" xmlns:v="urn:schemas-microsoft-com:vml" xmlns:wp14="http://schemas.microsoft.com/office/word/2010/wordprocessingDrawing" xmlns:wp="http://schemas.openxmlformats.org/drawingml/2006/wordprocessingDrawing" xmlns:w10="urn:schemas-microsoft-com:office:word" xmlns:w="http://schemas.openxmlformats.org/wordprocessingml/2006/main" xmlns:w14="http://schemas.microsoft.com/office/word/2010/wordml" xmlns:w15="http://schemas.microsoft.com/office/word/2012/wordml" xmlns:w16cex="http://schemas.microsoft.com/office/word/2018/wordml/cex" xmlns:w16cid="http://schemas.microsoft.com/office/word/2016/wordml/cid" xmlns:w16="http://schemas.microsoft.com/office/word/2018/wordml" xmlns:w16sdtdh="http://schemas.microsoft.com/office/word/2020/wordml/sdtdatahash" xmlns:w16se="http://schemas.microsoft.com/office/word/2015/wordml/symex" xmlns:wpg="http://schemas.microsoft.com/office/word/2010/wordprocessingGroup" xmlns:wpi="http://schemas.microsoft.com/office/word/2010/wordprocessingInk" xmlns:wne="http://schemas.microsoft.com/office/word/2006/wordml" xmlns:wps="http://schemas.microsoft.com/office/word/2010/wordprocessingShape" mc:Ignorable="w14 w15 w16se w16cid w16 w16cex w16sdtdh wp14">
+<w:document xmlns:wpc="http://schemas.microsoft.com/office/word/2010/wordprocessingCanvas" xmlns:cx="http://schemas.microsoft.com/office/drawing/2014/chartex" xmlns:cx1="http://schemas.microsoft.com/office/drawing/2015/9/8/chartex" xmlns:cx2="http://schemas.microsoft.com/office/drawing/2015/10/21/chartex" xmlns:cx3="http://schemas.microsoft.com/office/drawing/2016/5/9/chartex" xmlns:cx4="http://schemas.microsoft.com/office/drawing/2016/5/10/chartex" xmlns:cx5="http://schemas.microsoft.com/office/drawing/2016/5/11/chartex" xmlns:cx6="http://schemas.microsoft.com/office/drawing/2016/5/12/chartex" xmlns:cx7="http://schemas.microsoft.com/office/drawing/2016/5/13/chartex" xmlns:cx8="http://schemas.microsoft.com/office/drawing/2016/5/14/chartex" xmlns:mc="http://schemas.openxmlformats.org/markup-compatibility/2006" xmlns:aink="http://schemas.microsoft.com/office/drawing/2016/ink" xmlns:am3d="http://schemas.microsoft.com/office/drawing/2017/model3d" xmlns:o="urn:schemas-microsoft-com:office:office" xmlns:oel="http://schemas.microsoft.com/office/2019/extlst" xmlns:r="http://schemas.openxmlformats.org/officeDocument/2006/relationships" xmlns:m="http://schemas.openxmlformats.org/officeDocument/2006/math" xmlns:v="urn:schemas-microsoft-com:vml" xmlns:wp14="http://schemas.microsoft.com/office/word/2010/wordprocessingDrawing" xmlns:wp="http://schemas.openxmlformats.org/drawingml/2006/wordprocessingDrawing" xmlns:w10="urn:schemas-microsoft-com:office:word" xmlns:w="http://schemas.openxmlformats.org/wordprocessingml/2006/main" xmlns:w14="http://schemas.microsoft.com/office/word/2010/wordml" xmlns:w15="http://schemas.microsoft.com/office/word/2012/wordml" xmlns:w16cex="http://schemas.microsoft.com/office/word/2018/wordml/cex" xmlns:w16cid="http://schemas.microsoft.com/office/word/2016/wordml/cid" xmlns:w16="http://schemas.microsoft.com/office/word/2018/wordml" xmlns:w16du="http://schemas.microsoft.com/office/word/2023/wordml/word16du" xmlns:w16sdtdh="http://schemas.microsoft.com/office/word/2020/wordml/sdtdatahash" xmlns:w16sdtfl="http://schemas.microsoft.com/office/word/2024/wordml/sdtformatlock" xmlns:w16se="http://schemas.microsoft.com/office/word/2015/wordml/symex" xmlns:wpg="http://schemas.microsoft.com/office/word/2010/wordprocessingGroup" xmlns:wpi="http://schemas.microsoft.com/office/word/2010/wordprocessingInk" xmlns:wne="http://schemas.microsoft.com/office/word/2006/wordml" xmlns:wps="http://schemas.microsoft.com/office/word/2010/wordprocessingShape" mc:Ignorable="w14 w15 w16se w16cid w16 w16cex w16sdtdh w16sdtfl w16du wp14">
   <w:body>
     <w:p>
       <w:pPr>
@@ -94,6 +94,15 @@
     </w:p>
     <w:sdt>
       <w:sdtPr>
+        <w:rPr>
+          <w:rFonts w:asciiTheme="minorHAnsi" w:eastAsiaTheme="minorHAnsi" w:hAnsiTheme="minorHAnsi" w:cstheme="minorBidi"/>
+          <w:color w:val="auto"/>
+          <w:kern w:val="2"/>
+          <w:sz w:val="24"/>
+          <w:szCs w:val="24"/>
+          <w:lang w:eastAsia="en-US"/>
+          <w14:ligatures w14:val="standardContextual"/>
+        </w:rPr>
         <w:id w:val="1748765768"/>
         <w:docPartObj>
           <w:docPartGallery w:val="Table of Contents"/>
@@ -102,15 +111,8 @@
       </w:sdtPr>
       <w:sdtEndPr>
         <w:rPr>
-          <w:rFonts w:asciiTheme="minorHAnsi" w:eastAsiaTheme="minorHAnsi" w:hAnsiTheme="minorHAnsi" w:cstheme="minorBidi"/>
           <w:b/>
           <w:bCs/>
-          <w:color w:val="auto"/>
-          <w:kern w:val="2"/>
-          <w:sz w:val="24"/>
-          <w:szCs w:val="24"/>
-          <w:lang w:eastAsia="en-US"/>
-          <w14:ligatures w14:val="standardContextual"/>
         </w:rPr>
       </w:sdtEndPr>
       <w:sdtContent>
@@ -2211,7 +2213,7 @@
           <w:rFonts w:ascii="Aptos" w:eastAsia="Aptos" w:hAnsi="Aptos" w:cs="Aptos"/>
           <w:color w:val="000000" w:themeColor="text1"/>
         </w:rPr>
-        <w:t>ike est un site de vitrine de vente de vélo</w:t>
+        <w:t>ike est un site vitrine de vélo</w:t>
       </w:r>
       <w:r>
         <w:rPr>
@@ -2376,14 +2378,21 @@
           <w:rFonts w:ascii="Aptos" w:eastAsia="Aptos" w:hAnsi="Aptos" w:cs="Aptos"/>
           <w:color w:val="000000" w:themeColor="text1"/>
         </w:rPr>
-        <w:t>. C’est une entreprise française basé à Alès</w:t>
-      </w:r>
-      <w:r>
-        <w:rPr>
-          <w:rFonts w:ascii="Aptos" w:eastAsia="Aptos" w:hAnsi="Aptos" w:cs="Aptos"/>
-          <w:color w:val="000000" w:themeColor="text1"/>
-        </w:rPr>
-        <w:t xml:space="preserve"> qui importe principalement ses pièces de France</w:t>
+        <w:t>. C’est une entreprise française basé</w:t>
+      </w:r>
+      <w:r>
+        <w:rPr>
+          <w:rFonts w:ascii="Aptos" w:eastAsia="Aptos" w:hAnsi="Aptos" w:cs="Aptos"/>
+          <w:color w:val="000000" w:themeColor="text1"/>
+        </w:rPr>
+        <w:t xml:space="preserve">e dans le sud de la France </w:t>
+      </w:r>
+      <w:r>
+        <w:rPr>
+          <w:rFonts w:ascii="Aptos" w:eastAsia="Aptos" w:hAnsi="Aptos" w:cs="Aptos"/>
+          <w:color w:val="000000" w:themeColor="text1"/>
+        </w:rPr>
+        <w:t>qui importe principalement ses pièces de France</w:t>
       </w:r>
       <w:r>
         <w:rPr>
@@ -6401,6 +6410,7 @@
         <w:spacing w:after="0" w:line="240" w:lineRule="auto"/>
       </w:pPr>
       <w:r>
+        <w:lastRenderedPageBreak/>
         <w:t>Paiement :</w:t>
       </w:r>
     </w:p>
@@ -6427,7 +6437,6 @@
         <w:spacing w:after="0" w:line="240" w:lineRule="auto"/>
       </w:pPr>
       <w:r>
-        <w:lastRenderedPageBreak/>
         <w:t>Possibilité de revenir en arrière pour modifier la personnalisation</w:t>
       </w:r>
     </w:p>
@@ -6769,10 +6778,7 @@
         <w:t xml:space="preserve">Gaelle </w:t>
       </w:r>
       <w:r>
-        <w:t>MANBERT</w:t>
-      </w:r>
-      <w:r>
-        <w:t xml:space="preserve"> </w:t>
+        <w:t xml:space="preserve">MANBERT </w:t>
       </w:r>
       <w:r>
         <w:t>pourra faire la mise à jour du catalogue</w:t>
@@ -6790,6 +6796,9 @@
       </w:r>
     </w:p>
     <w:sectPr>
+      <w:footerReference w:type="even" r:id="rId13"/>
+      <w:footerReference w:type="default" r:id="rId14"/>
+      <w:footerReference w:type="first" r:id="rId15"/>
       <w:pgSz w:w="11906" w:h="16838"/>
       <w:pgMar w:top="1417" w:right="1417" w:bottom="1417" w:left="1417" w:header="708" w:footer="708" w:gutter="0"/>
       <w:cols w:space="708"/>
@@ -6800,7 +6809,7 @@
 </file>
 
 <file path=word/endnotes.xml><?xml version="1.0" encoding="utf-8"?>
-<w:endnotes xmlns:wpc="http://schemas.microsoft.com/office/word/2010/wordprocessingCanvas" xmlns:cx="http://schemas.microsoft.com/office/drawing/2014/chartex" xmlns:cx1="http://schemas.microsoft.com/office/drawing/2015/9/8/chartex" xmlns:cx2="http://schemas.microsoft.com/office/drawing/2015/10/21/chartex" xmlns:cx3="http://schemas.microsoft.com/office/drawing/2016/5/9/chartex" xmlns:cx4="http://schemas.microsoft.com/office/drawing/2016/5/10/chartex" xmlns:cx5="http://schemas.microsoft.com/office/drawing/2016/5/11/chartex" xmlns:cx6="http://schemas.microsoft.com/office/drawing/2016/5/12/chartex" xmlns:cx7="http://schemas.microsoft.com/office/drawing/2016/5/13/chartex" xmlns:cx8="http://schemas.microsoft.com/office/drawing/2016/5/14/chartex" xmlns:mc="http://schemas.openxmlformats.org/markup-compatibility/2006" xmlns:aink="http://schemas.microsoft.com/office/drawing/2016/ink" xmlns:am3d="http://schemas.microsoft.com/office/drawing/2017/model3d" xmlns:o="urn:schemas-microsoft-com:office:office" xmlns:oel="http://schemas.microsoft.com/office/2019/extlst" xmlns:r="http://schemas.openxmlformats.org/officeDocument/2006/relationships" xmlns:m="http://schemas.openxmlformats.org/officeDocument/2006/math" xmlns:v="urn:schemas-microsoft-com:vml" xmlns:wp14="http://schemas.microsoft.com/office/word/2010/wordprocessingDrawing" xmlns:wp="http://schemas.openxmlformats.org/drawingml/2006/wordprocessingDrawing" xmlns:w10="urn:schemas-microsoft-com:office:word" xmlns:w="http://schemas.openxmlformats.org/wordprocessingml/2006/main" xmlns:w14="http://schemas.microsoft.com/office/word/2010/wordml" xmlns:w15="http://schemas.microsoft.com/office/word/2012/wordml" xmlns:w16cex="http://schemas.microsoft.com/office/word/2018/wordml/cex" xmlns:w16cid="http://schemas.microsoft.com/office/word/2016/wordml/cid" xmlns:w16="http://schemas.microsoft.com/office/word/2018/wordml" xmlns:w16sdtdh="http://schemas.microsoft.com/office/word/2020/wordml/sdtdatahash" xmlns:w16se="http://schemas.microsoft.com/office/word/2015/wordml/symex" xmlns:wpg="http://schemas.microsoft.com/office/word/2010/wordprocessingGroup" xmlns:wpi="http://schemas.microsoft.com/office/word/2010/wordprocessingInk" xmlns:wne="http://schemas.microsoft.com/office/word/2006/wordml" xmlns:wps="http://schemas.microsoft.com/office/word/2010/wordprocessingShape" mc:Ignorable="w14 w15 w16se w16cid w16 w16cex w16sdtdh wp14">
+<w:endnotes xmlns:wpc="http://schemas.microsoft.com/office/word/2010/wordprocessingCanvas" xmlns:cx="http://schemas.microsoft.com/office/drawing/2014/chartex" xmlns:cx1="http://schemas.microsoft.com/office/drawing/2015/9/8/chartex" xmlns:cx2="http://schemas.microsoft.com/office/drawing/2015/10/21/chartex" xmlns:cx3="http://schemas.microsoft.com/office/drawing/2016/5/9/chartex" xmlns:cx4="http://schemas.microsoft.com/office/drawing/2016/5/10/chartex" xmlns:cx5="http://schemas.microsoft.com/office/drawing/2016/5/11/chartex" xmlns:cx6="http://schemas.microsoft.com/office/drawing/2016/5/12/chartex" xmlns:cx7="http://schemas.microsoft.com/office/drawing/2016/5/13/chartex" xmlns:cx8="http://schemas.microsoft.com/office/drawing/2016/5/14/chartex" xmlns:mc="http://schemas.openxmlformats.org/markup-compatibility/2006" xmlns:aink="http://schemas.microsoft.com/office/drawing/2016/ink" xmlns:am3d="http://schemas.microsoft.com/office/drawing/2017/model3d" xmlns:o="urn:schemas-microsoft-com:office:office" xmlns:oel="http://schemas.microsoft.com/office/2019/extlst" xmlns:r="http://schemas.openxmlformats.org/officeDocument/2006/relationships" xmlns:m="http://schemas.openxmlformats.org/officeDocument/2006/math" xmlns:v="urn:schemas-microsoft-com:vml" xmlns:wp14="http://schemas.microsoft.com/office/word/2010/wordprocessingDrawing" xmlns:wp="http://schemas.openxmlformats.org/drawingml/2006/wordprocessingDrawing" xmlns:w10="urn:schemas-microsoft-com:office:word" xmlns:w="http://schemas.openxmlformats.org/wordprocessingml/2006/main" xmlns:w14="http://schemas.microsoft.com/office/word/2010/wordml" xmlns:w15="http://schemas.microsoft.com/office/word/2012/wordml" xmlns:w16cex="http://schemas.microsoft.com/office/word/2018/wordml/cex" xmlns:w16cid="http://schemas.microsoft.com/office/word/2016/wordml/cid" xmlns:w16="http://schemas.microsoft.com/office/word/2018/wordml" xmlns:w16du="http://schemas.microsoft.com/office/word/2023/wordml/word16du" xmlns:w16sdtdh="http://schemas.microsoft.com/office/word/2020/wordml/sdtdatahash" xmlns:w16sdtfl="http://schemas.microsoft.com/office/word/2024/wordml/sdtformatlock" xmlns:w16se="http://schemas.microsoft.com/office/word/2015/wordml/symex" xmlns:wpg="http://schemas.microsoft.com/office/word/2010/wordprocessingGroup" xmlns:wpi="http://schemas.microsoft.com/office/word/2010/wordprocessingInk" xmlns:wne="http://schemas.microsoft.com/office/word/2006/wordml" xmlns:wps="http://schemas.microsoft.com/office/word/2010/wordprocessingShape" mc:Ignorable="w14 w15 w16se w16cid w16 w16cex w16sdtdh w16sdtfl w16du wp14">
   <w:endnote w:type="separator" w:id="-1">
     <w:p>
       <w:pPr>
@@ -6831,8 +6840,419 @@
 </w:endnotes>
 </file>
 
+<file path=word/footer1.xml><?xml version="1.0" encoding="utf-8"?>
+<w:ftr xmlns:wpc="http://schemas.microsoft.com/office/word/2010/wordprocessingCanvas" xmlns:cx="http://schemas.microsoft.com/office/drawing/2014/chartex" xmlns:cx1="http://schemas.microsoft.com/office/drawing/2015/9/8/chartex" xmlns:cx2="http://schemas.microsoft.com/office/drawing/2015/10/21/chartex" xmlns:cx3="http://schemas.microsoft.com/office/drawing/2016/5/9/chartex" xmlns:cx4="http://schemas.microsoft.com/office/drawing/2016/5/10/chartex" xmlns:cx5="http://schemas.microsoft.com/office/drawing/2016/5/11/chartex" xmlns:cx6="http://schemas.microsoft.com/office/drawing/2016/5/12/chartex" xmlns:cx7="http://schemas.microsoft.com/office/drawing/2016/5/13/chartex" xmlns:cx8="http://schemas.microsoft.com/office/drawing/2016/5/14/chartex" xmlns:mc="http://schemas.openxmlformats.org/markup-compatibility/2006" xmlns:aink="http://schemas.microsoft.com/office/drawing/2016/ink" xmlns:am3d="http://schemas.microsoft.com/office/drawing/2017/model3d" xmlns:o="urn:schemas-microsoft-com:office:office" xmlns:oel="http://schemas.microsoft.com/office/2019/extlst" xmlns:r="http://schemas.openxmlformats.org/officeDocument/2006/relationships" xmlns:m="http://schemas.openxmlformats.org/officeDocument/2006/math" xmlns:v="urn:schemas-microsoft-com:vml" xmlns:wp14="http://schemas.microsoft.com/office/word/2010/wordprocessingDrawing" xmlns:wp="http://schemas.openxmlformats.org/drawingml/2006/wordprocessingDrawing" xmlns:w10="urn:schemas-microsoft-com:office:word" xmlns:w="http://schemas.openxmlformats.org/wordprocessingml/2006/main" xmlns:w14="http://schemas.microsoft.com/office/word/2010/wordml" xmlns:w15="http://schemas.microsoft.com/office/word/2012/wordml" xmlns:w16cex="http://schemas.microsoft.com/office/word/2018/wordml/cex" xmlns:w16cid="http://schemas.microsoft.com/office/word/2016/wordml/cid" xmlns:w16="http://schemas.microsoft.com/office/word/2018/wordml" xmlns:w16du="http://schemas.microsoft.com/office/word/2023/wordml/word16du" xmlns:w16sdtdh="http://schemas.microsoft.com/office/word/2020/wordml/sdtdatahash" xmlns:w16sdtfl="http://schemas.microsoft.com/office/word/2024/wordml/sdtformatlock" xmlns:w16se="http://schemas.microsoft.com/office/word/2015/wordml/symex" xmlns:wpg="http://schemas.microsoft.com/office/word/2010/wordprocessingGroup" xmlns:wpi="http://schemas.microsoft.com/office/word/2010/wordprocessingInk" xmlns:wne="http://schemas.microsoft.com/office/word/2006/wordml" xmlns:wps="http://schemas.microsoft.com/office/word/2010/wordprocessingShape" mc:Ignorable="w14 w15 w16se w16cid w16 w16cex w16sdtdh w16sdtfl w16du wp14">
+  <w:p>
+    <w:pPr>
+      <w:pStyle w:val="Pieddepage"/>
+    </w:pPr>
+    <w:r>
+      <w:rPr>
+        <w:noProof/>
+      </w:rPr>
+      <mc:AlternateContent>
+        <mc:Choice Requires="wps">
+          <w:drawing>
+            <wp:anchor distT="0" distB="0" distL="0" distR="0" simplePos="0" relativeHeight="251659264" behindDoc="0" locked="0" layoutInCell="1" allowOverlap="1" wp14:anchorId="3C606654" wp14:editId="2000B88A">
+              <wp:simplePos x="635" y="635"/>
+              <wp:positionH relativeFrom="page">
+                <wp:align>center</wp:align>
+              </wp:positionH>
+              <wp:positionV relativeFrom="page">
+                <wp:align>bottom</wp:align>
+              </wp:positionV>
+              <wp:extent cx="1137920" cy="508000"/>
+              <wp:effectExtent l="0" t="0" r="5080" b="0"/>
+              <wp:wrapNone/>
+              <wp:docPr id="1106489396" name="Zone de texte 9" descr="Données personnelles">
+                <a:extLst xmlns:a="http://schemas.openxmlformats.org/drawingml/2006/main">
+                  <a:ext uri="{5AE41FA2-C0FF-4470-9BD4-5FADCA87CBE2}">
+                    <aclsh:classification xmlns:aclsh="http://schemas.microsoft.com/office/drawing/2020/classificationShape" classificationOutcomeType="ftr"/>
+                  </a:ext>
+                </a:extLst>
+              </wp:docPr>
+              <wp:cNvGraphicFramePr/>
+              <a:graphic xmlns:a="http://schemas.openxmlformats.org/drawingml/2006/main">
+                <a:graphicData uri="http://schemas.microsoft.com/office/word/2010/wordprocessingShape">
+                  <wps:wsp>
+                    <wps:cNvSpPr txBox="1"/>
+                    <wps:spPr>
+                      <a:xfrm>
+                        <a:off x="0" y="0"/>
+                        <a:ext cx="1137920" cy="508000"/>
+                      </a:xfrm>
+                      <a:prstGeom prst="rect">
+                        <a:avLst/>
+                      </a:prstGeom>
+                      <a:noFill/>
+                      <a:ln>
+                        <a:noFill/>
+                      </a:ln>
+                    </wps:spPr>
+                    <wps:txbx>
+                      <w:txbxContent>
+                        <w:p>
+                          <w:pPr>
+                            <w:spacing w:after="0"/>
+                            <w:rPr>
+                              <w:rFonts w:ascii="Arial" w:eastAsia="Arial" w:hAnsi="Arial" w:cs="Arial"/>
+                              <w:noProof/>
+                              <w:color w:val="000000"/>
+                              <w:sz w:val="18"/>
+                              <w:szCs w:val="18"/>
+                            </w:rPr>
+                          </w:pPr>
+                          <w:r>
+                            <w:rPr>
+                              <w:rFonts w:ascii="Arial" w:eastAsia="Arial" w:hAnsi="Arial" w:cs="Arial"/>
+                              <w:noProof/>
+                              <w:color w:val="000000"/>
+                              <w:sz w:val="18"/>
+                              <w:szCs w:val="18"/>
+                            </w:rPr>
+                            <w:t>Données personnelles</w:t>
+                          </w:r>
+                        </w:p>
+                      </w:txbxContent>
+                    </wps:txbx>
+                    <wps:bodyPr rot="0" spcFirstLastPara="0" vertOverflow="overflow" horzOverflow="overflow" vert="horz" wrap="none" lIns="0" tIns="0" rIns="0" bIns="355600" numCol="1" spcCol="0" rtlCol="0" fromWordArt="0" anchor="b" anchorCtr="0" forceAA="0" compatLnSpc="1">
+                      <a:prstTxWarp prst="textNoShape">
+                        <a:avLst/>
+                      </a:prstTxWarp>
+                      <a:spAutoFit/>
+                    </wps:bodyPr>
+                  </wps:wsp>
+                </a:graphicData>
+              </a:graphic>
+              <wp14:sizeRelH relativeFrom="margin">
+                <wp14:pctWidth>0</wp14:pctWidth>
+              </wp14:sizeRelH>
+              <wp14:sizeRelV relativeFrom="margin">
+                <wp14:pctHeight>0</wp14:pctHeight>
+              </wp14:sizeRelV>
+            </wp:anchor>
+          </w:drawing>
+        </mc:Choice>
+        <mc:Fallback>
+          <w:pict>
+            <v:shapetype w14:anchorId="3C606654" id="_x0000_t202" coordsize="21600,21600" o:spt="202" path="m,l,21600r21600,l21600,xe">
+              <v:stroke joinstyle="miter"/>
+              <v:path gradientshapeok="t" o:connecttype="rect"/>
+            </v:shapetype>
+            <v:shape id="Zone de texte 9" o:spid="_x0000_s1035" type="#_x0000_t202" alt="Données personnelles" style="position:absolute;margin-left:0;margin-top:0;width:89.6pt;height:40pt;z-index:251659264;visibility:visible;mso-wrap-style:none;mso-width-percent:0;mso-height-percent:0;mso-wrap-distance-left:0;mso-wrap-distance-top:0;mso-wrap-distance-right:0;mso-wrap-distance-bottom:0;mso-position-horizontal:center;mso-position-horizontal-relative:page;mso-position-vertical:bottom;mso-position-vertical-relative:page;mso-width-percent:0;mso-height-percent:0;mso-width-relative:margin;mso-height-relative:margin;v-text-anchor:bottom" o:gfxdata="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" filled="f" stroked="f">
+              <v:fill o:detectmouseclick="t"/>
+              <v:textbox style="mso-fit-shape-to-text:t" inset="0,0,0,28pt">
+                <w:txbxContent>
+                  <w:p>
+                    <w:pPr>
+                      <w:spacing w:after="0"/>
+                      <w:rPr>
+                        <w:rFonts w:ascii="Arial" w:eastAsia="Arial" w:hAnsi="Arial" w:cs="Arial"/>
+                        <w:noProof/>
+                        <w:color w:val="000000"/>
+                        <w:sz w:val="18"/>
+                        <w:szCs w:val="18"/>
+                      </w:rPr>
+                    </w:pPr>
+                    <w:r>
+                      <w:rPr>
+                        <w:rFonts w:ascii="Arial" w:eastAsia="Arial" w:hAnsi="Arial" w:cs="Arial"/>
+                        <w:noProof/>
+                        <w:color w:val="000000"/>
+                        <w:sz w:val="18"/>
+                        <w:szCs w:val="18"/>
+                      </w:rPr>
+                      <w:t>Données personnelles</w:t>
+                    </w:r>
+                  </w:p>
+                </w:txbxContent>
+              </v:textbox>
+              <w10:wrap anchorx="page" anchory="page"/>
+            </v:shape>
+          </w:pict>
+        </mc:Fallback>
+      </mc:AlternateContent>
+    </w:r>
+  </w:p>
+</w:ftr>
+</file>
+
+<file path=word/footer2.xml><?xml version="1.0" encoding="utf-8"?>
+<w:ftr xmlns:wpc="http://schemas.microsoft.com/office/word/2010/wordprocessingCanvas" xmlns:cx="http://schemas.microsoft.com/office/drawing/2014/chartex" xmlns:cx1="http://schemas.microsoft.com/office/drawing/2015/9/8/chartex" xmlns:cx2="http://schemas.microsoft.com/office/drawing/2015/10/21/chartex" xmlns:cx3="http://schemas.microsoft.com/office/drawing/2016/5/9/chartex" xmlns:cx4="http://schemas.microsoft.com/office/drawing/2016/5/10/chartex" xmlns:cx5="http://schemas.microsoft.com/office/drawing/2016/5/11/chartex" xmlns:cx6="http://schemas.microsoft.com/office/drawing/2016/5/12/chartex" xmlns:cx7="http://schemas.microsoft.com/office/drawing/2016/5/13/chartex" xmlns:cx8="http://schemas.microsoft.com/office/drawing/2016/5/14/chartex" xmlns:mc="http://schemas.openxmlformats.org/markup-compatibility/2006" xmlns:aink="http://schemas.microsoft.com/office/drawing/2016/ink" xmlns:am3d="http://schemas.microsoft.com/office/drawing/2017/model3d" xmlns:o="urn:schemas-microsoft-com:office:office" xmlns:oel="http://schemas.microsoft.com/office/2019/extlst" xmlns:r="http://schemas.openxmlformats.org/officeDocument/2006/relationships" xmlns:m="http://schemas.openxmlformats.org/officeDocument/2006/math" xmlns:v="urn:schemas-microsoft-com:vml" xmlns:wp14="http://schemas.microsoft.com/office/word/2010/wordprocessingDrawing" xmlns:wp="http://schemas.openxmlformats.org/drawingml/2006/wordprocessingDrawing" xmlns:w10="urn:schemas-microsoft-com:office:word" xmlns:w="http://schemas.openxmlformats.org/wordprocessingml/2006/main" xmlns:w14="http://schemas.microsoft.com/office/word/2010/wordml" xmlns:w15="http://schemas.microsoft.com/office/word/2012/wordml" xmlns:w16cex="http://schemas.microsoft.com/office/word/2018/wordml/cex" xmlns:w16cid="http://schemas.microsoft.com/office/word/2016/wordml/cid" xmlns:w16="http://schemas.microsoft.com/office/word/2018/wordml" xmlns:w16du="http://schemas.microsoft.com/office/word/2023/wordml/word16du" xmlns:w16sdtdh="http://schemas.microsoft.com/office/word/2020/wordml/sdtdatahash" xmlns:w16sdtfl="http://schemas.microsoft.com/office/word/2024/wordml/sdtformatlock" xmlns:w16se="http://schemas.microsoft.com/office/word/2015/wordml/symex" xmlns:wpg="http://schemas.microsoft.com/office/word/2010/wordprocessingGroup" xmlns:wpi="http://schemas.microsoft.com/office/word/2010/wordprocessingInk" xmlns:wne="http://schemas.microsoft.com/office/word/2006/wordml" xmlns:wps="http://schemas.microsoft.com/office/word/2010/wordprocessingShape" mc:Ignorable="w14 w15 w16se w16cid w16 w16cex w16sdtdh w16sdtfl w16du wp14">
+  <w:p>
+    <w:pPr>
+      <w:pStyle w:val="Pieddepage"/>
+    </w:pPr>
+    <w:r>
+      <w:rPr>
+        <w:noProof/>
+      </w:rPr>
+      <mc:AlternateContent>
+        <mc:Choice Requires="wps">
+          <w:drawing>
+            <wp:anchor distT="0" distB="0" distL="0" distR="0" simplePos="0" relativeHeight="251660288" behindDoc="0" locked="0" layoutInCell="1" allowOverlap="1" wp14:anchorId="1C26A8A4" wp14:editId="052CFB05">
+              <wp:simplePos x="899160" y="10058400"/>
+              <wp:positionH relativeFrom="page">
+                <wp:align>center</wp:align>
+              </wp:positionH>
+              <wp:positionV relativeFrom="page">
+                <wp:align>bottom</wp:align>
+              </wp:positionV>
+              <wp:extent cx="1137920" cy="508000"/>
+              <wp:effectExtent l="0" t="0" r="5080" b="0"/>
+              <wp:wrapNone/>
+              <wp:docPr id="2006655014" name="Zone de texte 10" descr="Données personnelles">
+                <a:extLst xmlns:a="http://schemas.openxmlformats.org/drawingml/2006/main">
+                  <a:ext uri="{5AE41FA2-C0FF-4470-9BD4-5FADCA87CBE2}">
+                    <aclsh:classification xmlns:aclsh="http://schemas.microsoft.com/office/drawing/2020/classificationShape" classificationOutcomeType="ftr"/>
+                  </a:ext>
+                </a:extLst>
+              </wp:docPr>
+              <wp:cNvGraphicFramePr/>
+              <a:graphic xmlns:a="http://schemas.openxmlformats.org/drawingml/2006/main">
+                <a:graphicData uri="http://schemas.microsoft.com/office/word/2010/wordprocessingShape">
+                  <wps:wsp>
+                    <wps:cNvSpPr txBox="1"/>
+                    <wps:spPr>
+                      <a:xfrm>
+                        <a:off x="0" y="0"/>
+                        <a:ext cx="1137920" cy="508000"/>
+                      </a:xfrm>
+                      <a:prstGeom prst="rect">
+                        <a:avLst/>
+                      </a:prstGeom>
+                      <a:noFill/>
+                      <a:ln>
+                        <a:noFill/>
+                      </a:ln>
+                    </wps:spPr>
+                    <wps:txbx>
+                      <w:txbxContent>
+                        <w:p>
+                          <w:pPr>
+                            <w:spacing w:after="0"/>
+                            <w:rPr>
+                              <w:rFonts w:ascii="Arial" w:eastAsia="Arial" w:hAnsi="Arial" w:cs="Arial"/>
+                              <w:noProof/>
+                              <w:color w:val="000000"/>
+                              <w:sz w:val="18"/>
+                              <w:szCs w:val="18"/>
+                            </w:rPr>
+                          </w:pPr>
+                          <w:r>
+                            <w:rPr>
+                              <w:rFonts w:ascii="Arial" w:eastAsia="Arial" w:hAnsi="Arial" w:cs="Arial"/>
+                              <w:noProof/>
+                              <w:color w:val="000000"/>
+                              <w:sz w:val="18"/>
+                              <w:szCs w:val="18"/>
+                            </w:rPr>
+                            <w:t>Données personnelles</w:t>
+                          </w:r>
+                        </w:p>
+                      </w:txbxContent>
+                    </wps:txbx>
+                    <wps:bodyPr rot="0" spcFirstLastPara="0" vertOverflow="overflow" horzOverflow="overflow" vert="horz" wrap="none" lIns="0" tIns="0" rIns="0" bIns="355600" numCol="1" spcCol="0" rtlCol="0" fromWordArt="0" anchor="b" anchorCtr="0" forceAA="0" compatLnSpc="1">
+                      <a:prstTxWarp prst="textNoShape">
+                        <a:avLst/>
+                      </a:prstTxWarp>
+                      <a:spAutoFit/>
+                    </wps:bodyPr>
+                  </wps:wsp>
+                </a:graphicData>
+              </a:graphic>
+              <wp14:sizeRelH relativeFrom="margin">
+                <wp14:pctWidth>0</wp14:pctWidth>
+              </wp14:sizeRelH>
+              <wp14:sizeRelV relativeFrom="margin">
+                <wp14:pctHeight>0</wp14:pctHeight>
+              </wp14:sizeRelV>
+            </wp:anchor>
+          </w:drawing>
+        </mc:Choice>
+        <mc:Fallback>
+          <w:pict>
+            <v:shapetype w14:anchorId="1C26A8A4" id="_x0000_t202" coordsize="21600,21600" o:spt="202" path="m,l,21600r21600,l21600,xe">
+              <v:stroke joinstyle="miter"/>
+              <v:path gradientshapeok="t" o:connecttype="rect"/>
+            </v:shapetype>
+            <v:shape id="Zone de texte 10" o:spid="_x0000_s1036" type="#_x0000_t202" alt="Données personnelles" style="position:absolute;margin-left:0;margin-top:0;width:89.6pt;height:40pt;z-index:251660288;visibility:visible;mso-wrap-style:none;mso-width-percent:0;mso-height-percent:0;mso-wrap-distance-left:0;mso-wrap-distance-top:0;mso-wrap-distance-right:0;mso-wrap-distance-bottom:0;mso-position-horizontal:center;mso-position-horizontal-relative:page;mso-position-vertical:bottom;mso-position-vertical-relative:page;mso-width-percent:0;mso-height-percent:0;mso-width-relative:margin;mso-height-relative:margin;v-text-anchor:bottom" o:gfxdata="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" filled="f" stroked="f">
+              <v:fill o:detectmouseclick="t"/>
+              <v:textbox style="mso-fit-shape-to-text:t" inset="0,0,0,28pt">
+                <w:txbxContent>
+                  <w:p>
+                    <w:pPr>
+                      <w:spacing w:after="0"/>
+                      <w:rPr>
+                        <w:rFonts w:ascii="Arial" w:eastAsia="Arial" w:hAnsi="Arial" w:cs="Arial"/>
+                        <w:noProof/>
+                        <w:color w:val="000000"/>
+                        <w:sz w:val="18"/>
+                        <w:szCs w:val="18"/>
+                      </w:rPr>
+                    </w:pPr>
+                    <w:r>
+                      <w:rPr>
+                        <w:rFonts w:ascii="Arial" w:eastAsia="Arial" w:hAnsi="Arial" w:cs="Arial"/>
+                        <w:noProof/>
+                        <w:color w:val="000000"/>
+                        <w:sz w:val="18"/>
+                        <w:szCs w:val="18"/>
+                      </w:rPr>
+                      <w:t>Données personnelles</w:t>
+                    </w:r>
+                  </w:p>
+                </w:txbxContent>
+              </v:textbox>
+              <w10:wrap anchorx="page" anchory="page"/>
+            </v:shape>
+          </w:pict>
+        </mc:Fallback>
+      </mc:AlternateContent>
+    </w:r>
+  </w:p>
+</w:ftr>
+</file>
+
+<file path=word/footer3.xml><?xml version="1.0" encoding="utf-8"?>
+<w:ftr xmlns:wpc="http://schemas.microsoft.com/office/word/2010/wordprocessingCanvas" xmlns:cx="http://schemas.microsoft.com/office/drawing/2014/chartex" xmlns:cx1="http://schemas.microsoft.com/office/drawing/2015/9/8/chartex" xmlns:cx2="http://schemas.microsoft.com/office/drawing/2015/10/21/chartex" xmlns:cx3="http://schemas.microsoft.com/office/drawing/2016/5/9/chartex" xmlns:cx4="http://schemas.microsoft.com/office/drawing/2016/5/10/chartex" xmlns:cx5="http://schemas.microsoft.com/office/drawing/2016/5/11/chartex" xmlns:cx6="http://schemas.microsoft.com/office/drawing/2016/5/12/chartex" xmlns:cx7="http://schemas.microsoft.com/office/drawing/2016/5/13/chartex" xmlns:cx8="http://schemas.microsoft.com/office/drawing/2016/5/14/chartex" xmlns:mc="http://schemas.openxmlformats.org/markup-compatibility/2006" xmlns:aink="http://schemas.microsoft.com/office/drawing/2016/ink" xmlns:am3d="http://schemas.microsoft.com/office/drawing/2017/model3d" xmlns:o="urn:schemas-microsoft-com:office:office" xmlns:oel="http://schemas.microsoft.com/office/2019/extlst" xmlns:r="http://schemas.openxmlformats.org/officeDocument/2006/relationships" xmlns:m="http://schemas.openxmlformats.org/officeDocument/2006/math" xmlns:v="urn:schemas-microsoft-com:vml" xmlns:wp14="http://schemas.microsoft.com/office/word/2010/wordprocessingDrawing" xmlns:wp="http://schemas.openxmlformats.org/drawingml/2006/wordprocessingDrawing" xmlns:w10="urn:schemas-microsoft-com:office:word" xmlns:w="http://schemas.openxmlformats.org/wordprocessingml/2006/main" xmlns:w14="http://schemas.microsoft.com/office/word/2010/wordml" xmlns:w15="http://schemas.microsoft.com/office/word/2012/wordml" xmlns:w16cex="http://schemas.microsoft.com/office/word/2018/wordml/cex" xmlns:w16cid="http://schemas.microsoft.com/office/word/2016/wordml/cid" xmlns:w16="http://schemas.microsoft.com/office/word/2018/wordml" xmlns:w16du="http://schemas.microsoft.com/office/word/2023/wordml/word16du" xmlns:w16sdtdh="http://schemas.microsoft.com/office/word/2020/wordml/sdtdatahash" xmlns:w16sdtfl="http://schemas.microsoft.com/office/word/2024/wordml/sdtformatlock" xmlns:w16se="http://schemas.microsoft.com/office/word/2015/wordml/symex" xmlns:wpg="http://schemas.microsoft.com/office/word/2010/wordprocessingGroup" xmlns:wpi="http://schemas.microsoft.com/office/word/2010/wordprocessingInk" xmlns:wne="http://schemas.microsoft.com/office/word/2006/wordml" xmlns:wps="http://schemas.microsoft.com/office/word/2010/wordprocessingShape" mc:Ignorable="w14 w15 w16se w16cid w16 w16cex w16sdtdh w16sdtfl w16du wp14">
+  <w:p>
+    <w:pPr>
+      <w:pStyle w:val="Pieddepage"/>
+    </w:pPr>
+    <w:r>
+      <w:rPr>
+        <w:noProof/>
+      </w:rPr>
+      <mc:AlternateContent>
+        <mc:Choice Requires="wps">
+          <w:drawing>
+            <wp:anchor distT="0" distB="0" distL="0" distR="0" simplePos="0" relativeHeight="251658240" behindDoc="0" locked="0" layoutInCell="1" allowOverlap="1" wp14:anchorId="6CB4661F" wp14:editId="6FF9A9D2">
+              <wp:simplePos x="635" y="635"/>
+              <wp:positionH relativeFrom="page">
+                <wp:align>center</wp:align>
+              </wp:positionH>
+              <wp:positionV relativeFrom="page">
+                <wp:align>bottom</wp:align>
+              </wp:positionV>
+              <wp:extent cx="1137920" cy="508000"/>
+              <wp:effectExtent l="0" t="0" r="5080" b="0"/>
+              <wp:wrapNone/>
+              <wp:docPr id="980024448" name="Zone de texte 8" descr="Données personnelles">
+                <a:extLst xmlns:a="http://schemas.openxmlformats.org/drawingml/2006/main">
+                  <a:ext uri="{5AE41FA2-C0FF-4470-9BD4-5FADCA87CBE2}">
+                    <aclsh:classification xmlns:aclsh="http://schemas.microsoft.com/office/drawing/2020/classificationShape" classificationOutcomeType="ftr"/>
+                  </a:ext>
+                </a:extLst>
+              </wp:docPr>
+              <wp:cNvGraphicFramePr/>
+              <a:graphic xmlns:a="http://schemas.openxmlformats.org/drawingml/2006/main">
+                <a:graphicData uri="http://schemas.microsoft.com/office/word/2010/wordprocessingShape">
+                  <wps:wsp>
+                    <wps:cNvSpPr txBox="1"/>
+                    <wps:spPr>
+                      <a:xfrm>
+                        <a:off x="0" y="0"/>
+                        <a:ext cx="1137920" cy="508000"/>
+                      </a:xfrm>
+                      <a:prstGeom prst="rect">
+                        <a:avLst/>
+                      </a:prstGeom>
+                      <a:noFill/>
+                      <a:ln>
+                        <a:noFill/>
+                      </a:ln>
+                    </wps:spPr>
+                    <wps:txbx>
+                      <w:txbxContent>
+                        <w:p>
+                          <w:pPr>
+                            <w:spacing w:after="0"/>
+                            <w:rPr>
+                              <w:rFonts w:ascii="Arial" w:eastAsia="Arial" w:hAnsi="Arial" w:cs="Arial"/>
+                              <w:noProof/>
+                              <w:color w:val="000000"/>
+                              <w:sz w:val="18"/>
+                              <w:szCs w:val="18"/>
+                            </w:rPr>
+                          </w:pPr>
+                          <w:r>
+                            <w:rPr>
+                              <w:rFonts w:ascii="Arial" w:eastAsia="Arial" w:hAnsi="Arial" w:cs="Arial"/>
+                              <w:noProof/>
+                              <w:color w:val="000000"/>
+                              <w:sz w:val="18"/>
+                              <w:szCs w:val="18"/>
+                            </w:rPr>
+                            <w:t>Données personnelles</w:t>
+                          </w:r>
+                        </w:p>
+                      </w:txbxContent>
+                    </wps:txbx>
+                    <wps:bodyPr rot="0" spcFirstLastPara="0" vertOverflow="overflow" horzOverflow="overflow" vert="horz" wrap="none" lIns="0" tIns="0" rIns="0" bIns="355600" numCol="1" spcCol="0" rtlCol="0" fromWordArt="0" anchor="b" anchorCtr="0" forceAA="0" compatLnSpc="1">
+                      <a:prstTxWarp prst="textNoShape">
+                        <a:avLst/>
+                      </a:prstTxWarp>
+                      <a:spAutoFit/>
+                    </wps:bodyPr>
+                  </wps:wsp>
+                </a:graphicData>
+              </a:graphic>
+              <wp14:sizeRelH relativeFrom="margin">
+                <wp14:pctWidth>0</wp14:pctWidth>
+              </wp14:sizeRelH>
+              <wp14:sizeRelV relativeFrom="margin">
+                <wp14:pctHeight>0</wp14:pctHeight>
+              </wp14:sizeRelV>
+            </wp:anchor>
+          </w:drawing>
+        </mc:Choice>
+        <mc:Fallback>
+          <w:pict>
+            <v:shapetype w14:anchorId="6CB4661F" id="_x0000_t202" coordsize="21600,21600" o:spt="202" path="m,l,21600r21600,l21600,xe">
+              <v:stroke joinstyle="miter"/>
+              <v:path gradientshapeok="t" o:connecttype="rect"/>
+            </v:shapetype>
+            <v:shape id="Zone de texte 8" o:spid="_x0000_s1037" type="#_x0000_t202" alt="Données personnelles" style="position:absolute;margin-left:0;margin-top:0;width:89.6pt;height:40pt;z-index:251658240;visibility:visible;mso-wrap-style:none;mso-width-percent:0;mso-height-percent:0;mso-wrap-distance-left:0;mso-wrap-distance-top:0;mso-wrap-distance-right:0;mso-wrap-distance-bottom:0;mso-position-horizontal:center;mso-position-horizontal-relative:page;mso-position-vertical:bottom;mso-position-vertical-relative:page;mso-width-percent:0;mso-height-percent:0;mso-width-relative:margin;mso-height-relative:margin;v-text-anchor:bottom" o:gfxdata="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" filled="f" stroked="f">
+              <v:fill o:detectmouseclick="t"/>
+              <v:textbox style="mso-fit-shape-to-text:t" inset="0,0,0,28pt">
+                <w:txbxContent>
+                  <w:p>
+                    <w:pPr>
+                      <w:spacing w:after="0"/>
+                      <w:rPr>
+                        <w:rFonts w:ascii="Arial" w:eastAsia="Arial" w:hAnsi="Arial" w:cs="Arial"/>
+                        <w:noProof/>
+                        <w:color w:val="000000"/>
+                        <w:sz w:val="18"/>
+                        <w:szCs w:val="18"/>
+                      </w:rPr>
+                    </w:pPr>
+                    <w:r>
+                      <w:rPr>
+                        <w:rFonts w:ascii="Arial" w:eastAsia="Arial" w:hAnsi="Arial" w:cs="Arial"/>
+                        <w:noProof/>
+                        <w:color w:val="000000"/>
+                        <w:sz w:val="18"/>
+                        <w:szCs w:val="18"/>
+                      </w:rPr>
+                      <w:t>Données personnelles</w:t>
+                    </w:r>
+                  </w:p>
+                </w:txbxContent>
+              </v:textbox>
+              <w10:wrap anchorx="page" anchory="page"/>
+            </v:shape>
+          </w:pict>
+        </mc:Fallback>
+      </mc:AlternateContent>
+    </w:r>
+  </w:p>
+</w:ftr>
+</file>
+
 <file path=word/footnotes.xml><?xml version="1.0" encoding="utf-8"?>
-<w:footnotes xmlns:wpc="http://schemas.microsoft.com/office/word/2010/wordprocessingCanvas" xmlns:cx="http://schemas.microsoft.com/office/drawing/2014/chartex" xmlns:cx1="http://schemas.microsoft.com/office/drawing/2015/9/8/chartex" xmlns:cx2="http://schemas.microsoft.com/office/drawing/2015/10/21/chartex" xmlns:cx3="http://schemas.microsoft.com/office/drawing/2016/5/9/chartex" xmlns:cx4="http://schemas.microsoft.com/office/drawing/2016/5/10/chartex" xmlns:cx5="http://schemas.microsoft.com/office/drawing/2016/5/11/chartex" xmlns:cx6="http://schemas.microsoft.com/office/drawing/2016/5/12/chartex" xmlns:cx7="http://schemas.microsoft.com/office/drawing/2016/5/13/chartex" xmlns:cx8="http://schemas.microsoft.com/office/drawing/2016/5/14/chartex" xmlns:mc="http://schemas.openxmlformats.org/markup-compatibility/2006" xmlns:aink="http://schemas.microsoft.com/office/drawing/2016/ink" xmlns:am3d="http://schemas.microsoft.com/office/drawing/2017/model3d" xmlns:o="urn:schemas-microsoft-com:office:office" xmlns:oel="http://schemas.microsoft.com/office/2019/extlst" xmlns:r="http://schemas.openxmlformats.org/officeDocument/2006/relationships" xmlns:m="http://schemas.openxmlformats.org/officeDocument/2006/math" xmlns:v="urn:schemas-microsoft-com:vml" xmlns:wp14="http://schemas.microsoft.com/office/word/2010/wordprocessingDrawing" xmlns:wp="http://schemas.openxmlformats.org/drawingml/2006/wordprocessingDrawing" xmlns:w10="urn:schemas-microsoft-com:office:word" xmlns:w="http://schemas.openxmlformats.org/wordprocessingml/2006/main" xmlns:w14="http://schemas.microsoft.com/office/word/2010/wordml" xmlns:w15="http://schemas.microsoft.com/office/word/2012/wordml" xmlns:w16cex="http://schemas.microsoft.com/office/word/2018/wordml/cex" xmlns:w16cid="http://schemas.microsoft.com/office/word/2016/wordml/cid" xmlns:w16="http://schemas.microsoft.com/office/word/2018/wordml" xmlns:w16sdtdh="http://schemas.microsoft.com/office/word/2020/wordml/sdtdatahash" xmlns:w16se="http://schemas.microsoft.com/office/word/2015/wordml/symex" xmlns:wpg="http://schemas.microsoft.com/office/word/2010/wordprocessingGroup" xmlns:wpi="http://schemas.microsoft.com/office/word/2010/wordprocessingInk" xmlns:wne="http://schemas.microsoft.com/office/word/2006/wordml" xmlns:wps="http://schemas.microsoft.com/office/word/2010/wordprocessingShape" mc:Ignorable="w14 w15 w16se w16cid w16 w16cex w16sdtdh wp14">
+<w:footnotes xmlns:wpc="http://schemas.microsoft.com/office/word/2010/wordprocessingCanvas" xmlns:cx="http://schemas.microsoft.com/office/drawing/2014/chartex" xmlns:cx1="http://schemas.microsoft.com/office/drawing/2015/9/8/chartex" xmlns:cx2="http://schemas.microsoft.com/office/drawing/2015/10/21/chartex" xmlns:cx3="http://schemas.microsoft.com/office/drawing/2016/5/9/chartex" xmlns:cx4="http://schemas.microsoft.com/office/drawing/2016/5/10/chartex" xmlns:cx5="http://schemas.microsoft.com/office/drawing/2016/5/11/chartex" xmlns:cx6="http://schemas.microsoft.com/office/drawing/2016/5/12/chartex" xmlns:cx7="http://schemas.microsoft.com/office/drawing/2016/5/13/chartex" xmlns:cx8="http://schemas.microsoft.com/office/drawing/2016/5/14/chartex" xmlns:mc="http://schemas.openxmlformats.org/markup-compatibility/2006" xmlns:aink="http://schemas.microsoft.com/office/drawing/2016/ink" xmlns:am3d="http://schemas.microsoft.com/office/drawing/2017/model3d" xmlns:o="urn:schemas-microsoft-com:office:office" xmlns:oel="http://schemas.microsoft.com/office/2019/extlst" xmlns:r="http://schemas.openxmlformats.org/officeDocument/2006/relationships" xmlns:m="http://schemas.openxmlformats.org/officeDocument/2006/math" xmlns:v="urn:schemas-microsoft-com:vml" xmlns:wp14="http://schemas.microsoft.com/office/word/2010/wordprocessingDrawing" xmlns:wp="http://schemas.openxmlformats.org/drawingml/2006/wordprocessingDrawing" xmlns:w10="urn:schemas-microsoft-com:office:word" xmlns:w="http://schemas.openxmlformats.org/wordprocessingml/2006/main" xmlns:w14="http://schemas.microsoft.com/office/word/2010/wordml" xmlns:w15="http://schemas.microsoft.com/office/word/2012/wordml" xmlns:w16cex="http://schemas.microsoft.com/office/word/2018/wordml/cex" xmlns:w16cid="http://schemas.microsoft.com/office/word/2016/wordml/cid" xmlns:w16="http://schemas.microsoft.com/office/word/2018/wordml" xmlns:w16du="http://schemas.microsoft.com/office/word/2023/wordml/word16du" xmlns:w16sdtdh="http://schemas.microsoft.com/office/word/2020/wordml/sdtdatahash" xmlns:w16sdtfl="http://schemas.microsoft.com/office/word/2024/wordml/sdtformatlock" xmlns:w16se="http://schemas.microsoft.com/office/word/2015/wordml/symex" xmlns:wpg="http://schemas.microsoft.com/office/word/2010/wordprocessingGroup" xmlns:wpi="http://schemas.microsoft.com/office/word/2010/wordprocessingInk" xmlns:wne="http://schemas.microsoft.com/office/word/2006/wordml" xmlns:wps="http://schemas.microsoft.com/office/word/2010/wordprocessingShape" mc:Ignorable="w14 w15 w16se w16cid w16 w16cex w16sdtdh w16sdtfl w16du wp14">
   <w:footnote w:type="separator" w:id="-1">
     <w:p>
       <w:pPr>
@@ -6882,7 +7302,7 @@
 </file>
 
 <file path=word/numbering.xml><?xml version="1.0" encoding="utf-8"?>
-<w:numbering xmlns:wpc="http://schemas.microsoft.com/office/word/2010/wordprocessingCanvas" xmlns:cx="http://schemas.microsoft.com/office/drawing/2014/chartex" xmlns:cx1="http://schemas.microsoft.com/office/drawing/2015/9/8/chartex" xmlns:cx2="http://schemas.microsoft.com/office/drawing/2015/10/21/chartex" xmlns:cx3="http://schemas.microsoft.com/office/drawing/2016/5/9/chartex" xmlns:cx4="http://schemas.microsoft.com/office/drawing/2016/5/10/chartex" xmlns:cx5="http://schemas.microsoft.com/office/drawing/2016/5/11/chartex" xmlns:cx6="http://schemas.microsoft.com/office/drawing/2016/5/12/chartex" xmlns:cx7="http://schemas.microsoft.com/office/drawing/2016/5/13/chartex" xmlns:cx8="http://schemas.microsoft.com/office/drawing/2016/5/14/chartex" xmlns:mc="http://schemas.openxmlformats.org/markup-compatibility/2006" xmlns:aink="http://schemas.microsoft.com/office/drawing/2016/ink" xmlns:am3d="http://schemas.microsoft.com/office/drawing/2017/model3d" xmlns:o="urn:schemas-microsoft-com:office:office" xmlns:oel="http://schemas.microsoft.com/office/2019/extlst" xmlns:r="http://schemas.openxmlformats.org/officeDocument/2006/relationships" xmlns:m="http://schemas.openxmlformats.org/officeDocument/2006/math" xmlns:v="urn:schemas-microsoft-com:vml" xmlns:wp14="http://schemas.microsoft.com/office/word/2010/wordprocessingDrawing" xmlns:wp="http://schemas.openxmlformats.org/drawingml/2006/wordprocessingDrawing" xmlns:w10="urn:schemas-microsoft-com:office:word" xmlns:w="http://schemas.openxmlformats.org/wordprocessingml/2006/main" xmlns:w14="http://schemas.microsoft.com/office/word/2010/wordml" xmlns:w15="http://schemas.microsoft.com/office/word/2012/wordml" xmlns:w16cex="http://schemas.microsoft.com/office/word/2018/wordml/cex" xmlns:w16cid="http://schemas.microsoft.com/office/word/2016/wordml/cid" xmlns:w16="http://schemas.microsoft.com/office/word/2018/wordml" xmlns:w16sdtdh="http://schemas.microsoft.com/office/word/2020/wordml/sdtdatahash" xmlns:w16se="http://schemas.microsoft.com/office/word/2015/wordml/symex" xmlns:wpg="http://schemas.microsoft.com/office/word/2010/wordprocessingGroup" xmlns:wpi="http://schemas.microsoft.com/office/word/2010/wordprocessingInk" xmlns:wne="http://schemas.microsoft.com/office/word/2006/wordml" xmlns:wps="http://schemas.microsoft.com/office/word/2010/wordprocessingShape" mc:Ignorable="w14 w15 w16se w16cid w16 w16cex w16sdtdh wp14">
+<w:numbering xmlns:wpc="http://schemas.microsoft.com/office/word/2010/wordprocessingCanvas" xmlns:cx="http://schemas.microsoft.com/office/drawing/2014/chartex" xmlns:cx1="http://schemas.microsoft.com/office/drawing/2015/9/8/chartex" xmlns:cx2="http://schemas.microsoft.com/office/drawing/2015/10/21/chartex" xmlns:cx3="http://schemas.microsoft.com/office/drawing/2016/5/9/chartex" xmlns:cx4="http://schemas.microsoft.com/office/drawing/2016/5/10/chartex" xmlns:cx5="http://schemas.microsoft.com/office/drawing/2016/5/11/chartex" xmlns:cx6="http://schemas.microsoft.com/office/drawing/2016/5/12/chartex" xmlns:cx7="http://schemas.microsoft.com/office/drawing/2016/5/13/chartex" xmlns:cx8="http://schemas.microsoft.com/office/drawing/2016/5/14/chartex" xmlns:mc="http://schemas.openxmlformats.org/markup-compatibility/2006" xmlns:aink="http://schemas.microsoft.com/office/drawing/2016/ink" xmlns:am3d="http://schemas.microsoft.com/office/drawing/2017/model3d" xmlns:o="urn:schemas-microsoft-com:office:office" xmlns:oel="http://schemas.microsoft.com/office/2019/extlst" xmlns:r="http://schemas.openxmlformats.org/officeDocument/2006/relationships" xmlns:m="http://schemas.openxmlformats.org/officeDocument/2006/math" xmlns:v="urn:schemas-microsoft-com:vml" xmlns:wp14="http://schemas.microsoft.com/office/word/2010/wordprocessingDrawing" xmlns:wp="http://schemas.openxmlformats.org/drawingml/2006/wordprocessingDrawing" xmlns:w10="urn:schemas-microsoft-com:office:word" xmlns:w="http://schemas.openxmlformats.org/wordprocessingml/2006/main" xmlns:w14="http://schemas.microsoft.com/office/word/2010/wordml" xmlns:w15="http://schemas.microsoft.com/office/word/2012/wordml" xmlns:w16cex="http://schemas.microsoft.com/office/word/2018/wordml/cex" xmlns:w16cid="http://schemas.microsoft.com/office/word/2016/wordml/cid" xmlns:w16="http://schemas.microsoft.com/office/word/2018/wordml" xmlns:w16du="http://schemas.microsoft.com/office/word/2023/wordml/word16du" xmlns:w16sdtdh="http://schemas.microsoft.com/office/word/2020/wordml/sdtdatahash" xmlns:w16sdtfl="http://schemas.microsoft.com/office/word/2024/wordml/sdtformatlock" xmlns:w16se="http://schemas.microsoft.com/office/word/2015/wordml/symex" xmlns:wpg="http://schemas.microsoft.com/office/word/2010/wordprocessingGroup" xmlns:wpi="http://schemas.microsoft.com/office/word/2010/wordprocessingInk" xmlns:wne="http://schemas.microsoft.com/office/word/2006/wordml" xmlns:wps="http://schemas.microsoft.com/office/word/2010/wordprocessingShape" mc:Ignorable="w14 w15 w16se w16cid w16 w16cex w16sdtdh w16sdtfl w16du wp14">
   <w:abstractNum w:abstractNumId="0" w15:restartNumberingAfterBreak="0">
     <w:nsid w:val="00B62E88"/>
     <w:multiLevelType w:val="hybridMultilevel"/>
@@ -11968,7 +12388,7 @@
 </file>
 
 <file path=word/styles.xml><?xml version="1.0" encoding="utf-8"?>
-<w:styles xmlns:mc="http://schemas.openxmlformats.org/markup-compatibility/2006" xmlns:r="http://schemas.openxmlformats.org/officeDocument/2006/relationships" xmlns:w="http://schemas.openxmlformats.org/wordprocessingml/2006/main" xmlns:w14="http://schemas.microsoft.com/office/word/2010/wordml" xmlns:w15="http://schemas.microsoft.com/office/word/2012/wordml" xmlns:w16cex="http://schemas.microsoft.com/office/word/2018/wordml/cex" xmlns:w16cid="http://schemas.microsoft.com/office/word/2016/wordml/cid" xmlns:w16="http://schemas.microsoft.com/office/word/2018/wordml" xmlns:w16sdtdh="http://schemas.microsoft.com/office/word/2020/wordml/sdtdatahash" xmlns:w16se="http://schemas.microsoft.com/office/word/2015/wordml/symex" mc:Ignorable="w14 w15 w16se w16cid w16 w16cex w16sdtdh">
+<w:styles xmlns:mc="http://schemas.openxmlformats.org/markup-compatibility/2006" xmlns:r="http://schemas.openxmlformats.org/officeDocument/2006/relationships" xmlns:w="http://schemas.openxmlformats.org/wordprocessingml/2006/main" xmlns:w14="http://schemas.microsoft.com/office/word/2010/wordml" xmlns:w15="http://schemas.microsoft.com/office/word/2012/wordml" xmlns:w16cex="http://schemas.microsoft.com/office/word/2018/wordml/cex" xmlns:w16cid="http://schemas.microsoft.com/office/word/2016/wordml/cid" xmlns:w16="http://schemas.microsoft.com/office/word/2018/wordml" xmlns:w16du="http://schemas.microsoft.com/office/word/2023/wordml/word16du" xmlns:w16sdtdh="http://schemas.microsoft.com/office/word/2020/wordml/sdtdatahash" xmlns:w16sdtfl="http://schemas.microsoft.com/office/word/2024/wordml/sdtformatlock" xmlns:w16se="http://schemas.microsoft.com/office/word/2015/wordml/symex" mc:Ignorable="w14 w15 w16se w16cid w16 w16cex w16sdtdh w16sdtfl w16du">
   <w:docDefaults>
     <w:rPrDefault>
       <w:rPr>
@@ -19535,4 +19955,10 @@
     <ds:schemaRef ds:uri="http://schemas.openxmlformats.org/officeDocument/2006/bibliography"/>
   </ds:schemaRefs>
 </ds:datastoreItem>
+</file>
+
+<file path=docMetadata/LabelInfo.xml><?xml version="1.0" encoding="utf-8"?>
+<clbl:labelList xmlns:clbl="http://schemas.microsoft.com/office/2020/mipLabelMetadata">
+  <clbl:label id="{c2414070-5698-46e4-abf8-b8f1b3c64e81}" enabled="1" method="Privileged" siteId="{b9fec68c-c92d-461e-9a97-3d03a0f18b82}" contentBits="3" removed="0"/>
+</clbl:labelList>
 </file>
</xml_diff>